<commit_message>
docs: trim work plan (remove Feasibility & User Feedback), rebalance schedule + Gantt, highlight Easy Planning
</commit_message>
<xml_diff>
--- a/proposal/EduPulse Project Proposal - FINAL.docx
+++ b/proposal/EduPulse Project Proposal - FINAL.docx
@@ -2537,6 +2537,9 @@
         <w:jc w:val="both"/>
       </w:pPr>
       <w:r>
+        <w:rPr>
+          <w:highlight w:val="yellow"/>
+        </w:rPr>
         <w:t>Easy Planning : Replaces paper timetables, alarms and WhatsApp groups with one centralized platform.</w:t>
       </w:r>
     </w:p>
@@ -4772,7 +4775,7 @@
               <w:rPr>
                 <w:sz w:val="20"/>
               </w:rPr>
-              <w:t>26/06/2026</w:t>
+              <w:t>28/06/2026</w:t>
             </w:r>
           </w:p>
         </w:tc>
@@ -4804,7 +4807,7 @@
                 <w:b w:val="0"/>
                 <w:sz w:val="20"/>
               </w:rPr>
-              <w:t>Feasibility &amp; Literature Review</w:t>
+              <w:t>System Design</w:t>
             </w:r>
           </w:p>
         </w:tc>
@@ -4818,7 +4821,7 @@
               <w:rPr>
                 <w:sz w:val="20"/>
               </w:rPr>
-              <w:t>19/06/2026</w:t>
+              <w:t>29/06/2026</w:t>
             </w:r>
           </w:p>
         </w:tc>
@@ -4832,7 +4835,7 @@
               <w:rPr>
                 <w:sz w:val="20"/>
               </w:rPr>
-              <w:t>30/06/2026</w:t>
+              <w:t>10/07/2026</w:t>
             </w:r>
           </w:p>
         </w:tc>
@@ -4847,7 +4850,7 @@
                 <w:b w:val="0"/>
                 <w:sz w:val="20"/>
               </w:rPr>
-              <w:t>Literature review completed</w:t>
+              <w:t>System architecture completed</w:t>
             </w:r>
           </w:p>
         </w:tc>
@@ -4864,7 +4867,7 @@
                 <w:b w:val="0"/>
                 <w:sz w:val="20"/>
               </w:rPr>
-              <w:t>System Design</w:t>
+              <w:t>Database Design</w:t>
             </w:r>
           </w:p>
         </w:tc>
@@ -4878,7 +4881,7 @@
               <w:rPr>
                 <w:sz w:val="20"/>
               </w:rPr>
-              <w:t>27/06/2026</w:t>
+              <w:t>11/07/2026</w:t>
             </w:r>
           </w:p>
         </w:tc>
@@ -4892,7 +4895,7 @@
               <w:rPr>
                 <w:sz w:val="20"/>
               </w:rPr>
-              <w:t>07/07/2026</w:t>
+              <w:t>18/07/2026</w:t>
             </w:r>
           </w:p>
         </w:tc>
@@ -4907,7 +4910,7 @@
                 <w:b w:val="0"/>
                 <w:sz w:val="20"/>
               </w:rPr>
-              <w:t>System architecture completed</w:t>
+              <w:t>Database schema finalized</w:t>
             </w:r>
           </w:p>
         </w:tc>
@@ -4924,7 +4927,7 @@
                 <w:b w:val="0"/>
                 <w:sz w:val="20"/>
               </w:rPr>
-              <w:t>Database Design</w:t>
+              <w:t>Frontend Development</w:t>
             </w:r>
           </w:p>
         </w:tc>
@@ -4938,7 +4941,7 @@
               <w:rPr>
                 <w:sz w:val="20"/>
               </w:rPr>
-              <w:t>08/07/2026</w:t>
+              <w:t>19/07/2026</w:t>
             </w:r>
           </w:p>
         </w:tc>
@@ -4952,7 +4955,7 @@
               <w:rPr>
                 <w:sz w:val="20"/>
               </w:rPr>
-              <w:t>15/07/2026</w:t>
+              <w:t>01/08/2026</w:t>
             </w:r>
           </w:p>
         </w:tc>
@@ -4967,7 +4970,7 @@
                 <w:b w:val="0"/>
                 <w:sz w:val="20"/>
               </w:rPr>
-              <w:t>Database schema finalized</w:t>
+              <w:t>UI modules completed</w:t>
             </w:r>
           </w:p>
         </w:tc>
@@ -4984,7 +4987,7 @@
                 <w:b w:val="0"/>
                 <w:sz w:val="20"/>
               </w:rPr>
-              <w:t>Frontend Development</w:t>
+              <w:t>Backend Development</w:t>
             </w:r>
           </w:p>
         </w:tc>
@@ -4998,7 +5001,7 @@
               <w:rPr>
                 <w:sz w:val="20"/>
               </w:rPr>
-              <w:t>16/07/2026</w:t>
+              <w:t>26/07/2026</w:t>
             </w:r>
           </w:p>
         </w:tc>
@@ -5012,7 +5015,7 @@
               <w:rPr>
                 <w:sz w:val="20"/>
               </w:rPr>
-              <w:t>29/07/2026</w:t>
+              <w:t>09/08/2026</w:t>
             </w:r>
           </w:p>
         </w:tc>
@@ -5027,7 +5030,7 @@
                 <w:b w:val="0"/>
                 <w:sz w:val="20"/>
               </w:rPr>
-              <w:t>UI modules completed</w:t>
+              <w:t>Backend functionalities completed</w:t>
             </w:r>
           </w:p>
         </w:tc>
@@ -5044,7 +5047,7 @@
                 <w:b w:val="0"/>
                 <w:sz w:val="20"/>
               </w:rPr>
-              <w:t>Backend Development</w:t>
+              <w:t>System Integration</w:t>
             </w:r>
           </w:p>
         </w:tc>
@@ -5058,7 +5061,7 @@
               <w:rPr>
                 <w:sz w:val="20"/>
               </w:rPr>
-              <w:t>23/07/2026</w:t>
+              <w:t>10/08/2026</w:t>
             </w:r>
           </w:p>
         </w:tc>
@@ -5072,7 +5075,7 @@
               <w:rPr>
                 <w:sz w:val="20"/>
               </w:rPr>
-              <w:t>06/08/2026</w:t>
+              <w:t>13/08/2026</w:t>
             </w:r>
           </w:p>
         </w:tc>
@@ -5087,7 +5090,7 @@
                 <w:b w:val="0"/>
                 <w:sz w:val="20"/>
               </w:rPr>
-              <w:t>Backend functionalities completed</w:t>
+              <w:t>Integrated system ready</w:t>
             </w:r>
           </w:p>
         </w:tc>
@@ -5104,7 +5107,7 @@
                 <w:b w:val="0"/>
                 <w:sz w:val="20"/>
               </w:rPr>
-              <w:t>System Integration</w:t>
+              <w:t>Testing &amp; Debugging</w:t>
             </w:r>
           </w:p>
         </w:tc>
@@ -5118,7 +5121,7 @@
               <w:rPr>
                 <w:sz w:val="20"/>
               </w:rPr>
-              <w:t>07/08/2026</w:t>
+              <w:t>14/08/2026</w:t>
             </w:r>
           </w:p>
         </w:tc>
@@ -5132,7 +5135,7 @@
               <w:rPr>
                 <w:sz w:val="20"/>
               </w:rPr>
-              <w:t>11/08/2026</w:t>
+              <w:t>16/08/2026</w:t>
             </w:r>
           </w:p>
         </w:tc>
@@ -5147,7 +5150,7 @@
                 <w:b w:val="0"/>
                 <w:sz w:val="20"/>
               </w:rPr>
-              <w:t>Integrated system ready</w:t>
+              <w:t>Error-free system</w:t>
             </w:r>
           </w:p>
         </w:tc>
@@ -5164,7 +5167,7 @@
                 <w:b w:val="0"/>
                 <w:sz w:val="20"/>
               </w:rPr>
-              <w:t>Testing &amp; Debugging</w:t>
+              <w:t>Documentation</w:t>
             </w:r>
           </w:p>
         </w:tc>
@@ -5178,7 +5181,7 @@
               <w:rPr>
                 <w:sz w:val="20"/>
               </w:rPr>
-              <w:t>12/08/2026</w:t>
+              <w:t>16/08/2026</w:t>
             </w:r>
           </w:p>
         </w:tc>
@@ -5192,7 +5195,7 @@
               <w:rPr>
                 <w:sz w:val="20"/>
               </w:rPr>
-              <w:t>14/08/2026</w:t>
+              <w:t>17/08/2026</w:t>
             </w:r>
           </w:p>
         </w:tc>
@@ -5207,7 +5210,7 @@
                 <w:b w:val="0"/>
                 <w:sz w:val="20"/>
               </w:rPr>
-              <w:t>Error-free system</w:t>
+              <w:t>Final report completed</w:t>
             </w:r>
           </w:p>
         </w:tc>
@@ -5224,7 +5227,7 @@
                 <w:b w:val="0"/>
                 <w:sz w:val="20"/>
               </w:rPr>
-              <w:t>User Feedback &amp; Improvements</w:t>
+              <w:t>Final Review &amp; Presentation</w:t>
             </w:r>
           </w:p>
         </w:tc>
@@ -5238,7 +5241,7 @@
               <w:rPr>
                 <w:sz w:val="20"/>
               </w:rPr>
-              <w:t>15/08/2026</w:t>
+              <w:t>18/08/2026</w:t>
             </w:r>
           </w:p>
         </w:tc>
@@ -5252,7 +5255,7 @@
               <w:rPr>
                 <w:sz w:val="20"/>
               </w:rPr>
-              <w:t>16/08/2026</w:t>
+              <w:t>18/08/2026</w:t>
             </w:r>
           </w:p>
         </w:tc>
@@ -5267,126 +5270,6 @@
                 <w:b w:val="0"/>
                 <w:sz w:val="20"/>
               </w:rPr>
-              <w:t>System refined</w:t>
-            </w:r>
-          </w:p>
-        </w:tc>
-      </w:tr>
-      <w:tr>
-        <w:tc>
-          <w:tcPr>
-            <w:tcW w:type="dxa" w:w="2500"/>
-          </w:tcPr>
-          <w:p>
-            <w:r/>
-            <w:r>
-              <w:rPr>
-                <w:b w:val="0"/>
-                <w:sz w:val="20"/>
-              </w:rPr>
-              <w:t>Documentation</w:t>
-            </w:r>
-          </w:p>
-        </w:tc>
-        <w:tc>
-          <w:tcPr>
-            <w:tcW w:type="dxa" w:w="1350"/>
-          </w:tcPr>
-          <w:p>
-            <w:r/>
-            <w:r>
-              <w:rPr>
-                <w:sz w:val="20"/>
-              </w:rPr>
-              <w:t>16/08/2026</w:t>
-            </w:r>
-          </w:p>
-        </w:tc>
-        <w:tc>
-          <w:tcPr>
-            <w:tcW w:type="dxa" w:w="1350"/>
-          </w:tcPr>
-          <w:p>
-            <w:r/>
-            <w:r>
-              <w:rPr>
-                <w:sz w:val="20"/>
-              </w:rPr>
-              <w:t>17/08/2026</w:t>
-            </w:r>
-          </w:p>
-        </w:tc>
-        <w:tc>
-          <w:tcPr>
-            <w:tcW w:type="dxa" w:w="3550"/>
-          </w:tcPr>
-          <w:p>
-            <w:r/>
-            <w:r>
-              <w:rPr>
-                <w:b w:val="0"/>
-                <w:sz w:val="20"/>
-              </w:rPr>
-              <w:t>Final report completed</w:t>
-            </w:r>
-          </w:p>
-        </w:tc>
-      </w:tr>
-      <w:tr>
-        <w:tc>
-          <w:tcPr>
-            <w:tcW w:type="dxa" w:w="2500"/>
-          </w:tcPr>
-          <w:p>
-            <w:r/>
-            <w:r>
-              <w:rPr>
-                <w:b w:val="0"/>
-                <w:sz w:val="20"/>
-              </w:rPr>
-              <w:t>Final Review &amp; Presentation</w:t>
-            </w:r>
-          </w:p>
-        </w:tc>
-        <w:tc>
-          <w:tcPr>
-            <w:tcW w:type="dxa" w:w="1350"/>
-          </w:tcPr>
-          <w:p>
-            <w:r/>
-            <w:r>
-              <w:rPr>
-                <w:sz w:val="20"/>
-              </w:rPr>
-              <w:t>18/08/2026</w:t>
-            </w:r>
-          </w:p>
-        </w:tc>
-        <w:tc>
-          <w:tcPr>
-            <w:tcW w:type="dxa" w:w="1350"/>
-          </w:tcPr>
-          <w:p>
-            <w:r/>
-            <w:r>
-              <w:rPr>
-                <w:sz w:val="20"/>
-              </w:rPr>
-              <w:t>18/08/2026</w:t>
-            </w:r>
-          </w:p>
-        </w:tc>
-        <w:tc>
-          <w:tcPr>
-            <w:tcW w:type="dxa" w:w="3550"/>
-          </w:tcPr>
-          <w:p>
-            <w:r/>
-            <w:r>
-              <w:rPr>
-                <w:b w:val="0"/>
-                <w:sz w:val="20"/>
-              </w:rPr>
               <w:t>Project submission</w:t>
             </w:r>
           </w:p>
@@ -5401,7 +5284,7 @@
       <w:r>
         <w:drawing>
           <wp:inline xmlns:a="http://schemas.openxmlformats.org/drawingml/2006/main" xmlns:pic="http://schemas.openxmlformats.org/drawingml/2006/picture">
-            <wp:extent cx="5669280" cy="2980933"/>
+            <wp:extent cx="5760720" cy="2728574"/>
             <wp:docPr id="2126248103" name="Picture 2126248103"/>
             <wp:cNvGraphicFramePr>
               <a:graphicFrameLocks noChangeAspect="1"/>
@@ -5410,11 +5293,11 @@
               <a:graphicData uri="http://schemas.openxmlformats.org/drawingml/2006/picture">
                 <pic:pic>
                   <pic:nvPicPr>
-                    <pic:cNvPr id="0" name="gantt_v3.png"/>
+                    <pic:cNvPr id="0" name="gantt_v4.png"/>
                     <pic:cNvPicPr/>
                   </pic:nvPicPr>
                   <pic:blipFill>
-                    <a:blip r:embed="rId16"/>
+                    <a:blip r:embed="rId14"/>
                     <a:stretch>
                       <a:fillRect/>
                     </a:stretch>
@@ -5422,7 +5305,7 @@
                   <pic:spPr>
                     <a:xfrm>
                       <a:off x="0" y="0"/>
-                      <a:ext cx="5669280" cy="2980933"/>
+                      <a:ext cx="5760720" cy="2728574"/>
                     </a:xfrm>
                     <a:prstGeom prst="rect"/>
                   </pic:spPr>

</xml_diff>